<commit_message>
chore: rebuild the disk lab guide after the fstab fix
Co-Authored-By: Claude Opus 5 <noreply@anthropic.com>
</commit_message>
<xml_diff>
--- a/public/labs/os/kmp-24/ЛР14_ОС_Дискові_пристрої_та_файлові_системи.docx
+++ b/public/labs/os/kmp-24/ЛР14_ОС_Дискові_пристрої_та_файлові_системи.docx
@@ -2414,16 +2414,16 @@
               <w:spacing w:before="0" w:after="0" w:line="200" w:lineRule="auto"/>
             </w:pPr>
             <w:r>
-              <w:t xml:space="preserve">echo "UUID=$(sudo blkid -s UUID -o value /dev/sdb1) /mnt/data1 ext4 defaults,nofail 0 2" \</w:t>
-            </w:r>
-          </w:p>
-          <w:p>
-            <w:pPr>
-              <w:pStyle w:val="SourceCode"/>
-              <w:spacing w:before="0" w:after="0" w:line="200" w:lineRule="auto"/>
-            </w:pPr>
-            <w:r>
-              <w:t xml:space="preserve">  | sudo tee -a /etc/fstab</w:t>
+              <w:t xml:space="preserve">UUID=$(sudo blkid -s UUID -o value /dev/sdb1)</w:t>
+            </w:r>
+          </w:p>
+          <w:p>
+            <w:pPr>
+              <w:pStyle w:val="SourceCode"/>
+              <w:spacing w:before="0" w:after="0" w:line="200" w:lineRule="auto"/>
+            </w:pPr>
+            <w:r>
+              <w:t xml:space="preserve">echo "UUID=$UUID /mnt/data1 ext4 defaults,nofail 0 2" | sudo tee -a /etc/fstab</w:t>
             </w:r>
           </w:p>
           <w:p>

</xml_diff>